<commit_message>
Upgrade FACTR 2 reproduction report to revision 2.0 and add execution guide
- Replace report source with the corrected v2: 0.5 s history window, L1 contact
  score, joint-mean MAE, calibration logic, data contract, event-level metrics
- Add paper/repro_guide.md and a guide build profile (11-page DOCX/PDF)
- Fix 50 Hz window wording in the PiPER hardware doc and rebuild it
- Improve PDF typography: URL-aware alignment, per-profile cover copy
- Update README index and ignore QA render output
</commit_message>
<xml_diff>
--- a/LEFS/piper_docs/PiPER_标准版_官方参数与使用说明.docx
+++ b/LEFS/piper_docs/PiPER_标准版_官方参数与使用说明.docx
@@ -16600,7 +16600,7 @@
           <w:color w:val="1A1A1A"/>
           <w:sz w:val="21"/>
         </w:rPr>
-        <w:t xml:space="preserve">（1 秒历史 @100 Hz）换算成 </w:t>
+        <w:t xml:space="preserve">（约 0.5 秒历史 @100 Hz）换算成 </w:t>
       </w:r>
       <w:r>
         <w:rPr>
@@ -16620,7 +16620,7 @@
           <w:color w:val="1A1A1A"/>
           <w:sz w:val="21"/>
         </w:rPr>
-        <w:t>（1 秒 @50 Hz）；</w:t>
+        <w:t>（约 0.5 秒 @50 Hz）；</w:t>
       </w:r>
     </w:p>
     <w:p>

</xml_diff>